<commit_message>
Fix 8 DOCX defects from sample review
1. null/20 scores → 'Not assessed' for INSUFFICIENT/SUPPRESSED categories
2. Report ID excludes ambiguous chars (O/0/I/1/l)
3. Priority Actions header omitted when no actions exist
4. Transmittal letter: named recipient, assessment trigger in P1,
   scope summary P2, findings preview P3, limitations + continued
   service P4. Four proper paragraphs, not three generic ones.
5. TOC fully dynamic: Equipment Log, Spatial Summary, Recommendations
   only listed when data present
6. Phone format: (301) 541-8362
7. Building context notes assessment trigger when present
8. INFO-only findings → 'No findings of medium or higher severity'
   instead of near-empty table

https://claude.ai/code/session_017w5vm7Nq9LhEhmKLVBQFhX
</commit_message>
<xml_diff>
--- a/sample-report.docx
+++ b/sample-report.docx
@@ -170,7 +170,7 @@
           <w:sz w:val="22"/>
           <w:szCs w:val="22"/>
         </w:rPr>
-        <w:t xml:space="preserve">Report ID: PSEC-IAQ-2026-04-RLH</w:t>
+        <w:t xml:space="preserve">Report ID: PSEC-IAQ-2026-04-7M3</w:t>
       </w:r>
     </w:p>
     <w:p>
@@ -792,7 +792,7 @@
           <w:sz w:val="14"/>
           <w:szCs w:val="14"/>
         </w:rPr>
-        <w:t xml:space="preserve">Prudence Safety &amp; Environmental Consulting, LLC  |  Report ID: PSEC-IAQ-2026-04-RLH  |  April 23, 2026</w:t>
+        <w:t xml:space="preserve">Prudence Safety &amp; Environmental Consulting, LLC  |  Report ID: PSEC-IAQ-2026-04-7M3  |  April 23, 2026</w:t>
       </w:r>
     </w:p>
     <w:p>

</xml_diff>